<commit_message>
Rebuild the API on a normalized schema and rewrite the planning docs for v2
- 16 tables with FK/UNIQUE/CHECK constraints; content seeded from the app JSON
- Idempotent record upserts, parent check rules, report, push targets
- 19 API and database-integrity tests; DDL exported for PostgreSQL and SQLite
- 12 planning documents (HTML + DOCX) with use-case, class, sequence, state and ER diagrams

Co-Authored-By: Claude Fable 5.1 <noreply@anthropic.com>
</commit_message>
<xml_diff>
--- a/docs/docx/01-비전과-범위.docx
+++ b/docs/docx/01-비전과-범위.docx
@@ -7,7 +7,7 @@
         <w:rPr>
           <w:color w:val="1F7A5C"/>
         </w:rPr>
-        <w:t>SoundsFun Bridge · MVP 문서</w:t>
+        <w:t>SoundsFun Bridge · MVP 문서 v2</w:t>
       </w:r>
     </w:p>
     <w:p>
@@ -16,6 +16,33 @@
       </w:pPr>
       <w:r>
         <w:t>비전과 범위</w:t>
+      </w:r>
+    </w:p>
+    <w:p>
+      <w:pPr>
+        <w:pStyle w:val="Heading1"/>
+      </w:pPr>
+      <w:r>
+        <w:t>한 줄</w:t>
+      </w:r>
+    </w:p>
+    <w:p>
+      <w:pPr>
+        <w:ind w:left="340"/>
+      </w:pPr>
+      <w:r>
+        <w:rPr>
+          <w:i/>
+        </w:rPr>
+        <w:t>아이가 매일 같은 시간에 영어 소리를 듣고, 들은 말을 찾고 말해 보며, 부모는 한 화면에서 확인한다.</w:t>
+      </w:r>
+    </w:p>
+    <w:p>
+      <w:pPr>
+        <w:pStyle w:val="Heading1"/>
+      </w:pPr>
+      <w:r>
+        <w:t>이번 버전</w:t>
       </w:r>
     </w:p>
     <w:tbl>
@@ -81,7 +108,7 @@
               <w:rPr>
                 <w:sz w:val="18"/>
               </w:rPr>
-              <w:t>제품명</w:t>
+              <w:t>이름</w:t>
             </w:r>
           </w:p>
         </w:tc>
@@ -95,7 +122,7 @@
               <w:rPr>
                 <w:sz w:val="18"/>
               </w:rPr>
-              <w:t>사운즈펀 브릿지 (SoundsFun Bridge)</w:t>
+              <w:t>SoundsFun (사운즈펀 브릿지) v0.2</w:t>
             </w:r>
           </w:p>
         </w:tc>
@@ -111,7 +138,7 @@
               <w:rPr>
                 <w:sz w:val="18"/>
               </w:rPr>
-              <w:t>한 줄</w:t>
+              <w:t>범위</w:t>
             </w:r>
           </w:p>
         </w:tc>
@@ -123,39 +150,16 @@
             <w:r/>
             <w:r>
               <w:rPr>
+                <w:b/>
                 <w:sz w:val="18"/>
               </w:rPr>
-              <w:t>아이가 매일 4번, 영어 소리에 놀듯이 노출되는 루틴 앱</w:t>
+              <w:t>Week 1 · Colors</w:t>
             </w:r>
-          </w:p>
-        </w:tc>
-      </w:tr>
-      <w:tr>
-        <w:tc>
-          <w:tcPr>
-            <w:tcW w:type="dxa" w:w="4986"/>
-          </w:tcPr>
-          <w:p>
-            <w:r/>
             <w:r>
               <w:rPr>
                 <w:sz w:val="18"/>
               </w:rPr>
-              <w:t>버전</w:t>
-            </w:r>
-          </w:p>
-        </w:tc>
-        <w:tc>
-          <w:tcPr>
-            <w:tcW w:type="dxa" w:w="4986"/>
-          </w:tcPr>
-          <w:p>
-            <w:r/>
-            <w:r>
-              <w:rPr>
-                <w:sz w:val="18"/>
-              </w:rPr>
-              <w:t>MVP · Week 1 ‘Colors’</w:t>
+              <w:t xml:space="preserve"> 한 주. 파닉스는 제외</w:t>
             </w:r>
           </w:p>
         </w:tc>
@@ -185,7 +189,7 @@
               <w:rPr>
                 <w:sz w:val="18"/>
               </w:rPr>
-              <w:t>모바일 앱(iOS·Android) + 모바일 웹, 코드 한 벌(Expo)</w:t>
+              <w:t>React Native(Expo) 한 벌로 모바일 웹·PWA와 앱. 반응형</w:t>
             </w:r>
           </w:p>
         </w:tc>
@@ -201,7 +205,7 @@
               <w:rPr>
                 <w:sz w:val="18"/>
               </w:rPr>
-              <w:t>작성</w:t>
+              <w:t>디자인</w:t>
             </w:r>
           </w:p>
         </w:tc>
@@ -215,129 +219,20 @@
               <w:rPr>
                 <w:sz w:val="18"/>
               </w:rPr>
-              <w:t>2026-09-16 · 강성준</w:t>
-            </w:r>
-          </w:p>
-        </w:tc>
-      </w:tr>
-    </w:tbl>
-    <w:p/>
-    <w:p>
-      <w:pPr>
-        <w:pStyle w:val="Heading1"/>
-      </w:pPr>
-      <w:r>
-        <w:t>문제</w:t>
-      </w:r>
-    </w:p>
-    <w:p>
-      <w:r>
-        <w:t>유튜브에 좋은 영어 노래·스토리는 많지만, 부모가 매일 무엇을 언제 틀지 정하고 챙기는 일은 지속되지 않는다. 종이 루틴표와 QR로 운영해 보니 알림과 기록이 없어 습관이 끊겼다.</w:t>
-      </w:r>
-    </w:p>
-    <w:p>
-      <w:pPr>
-        <w:pStyle w:val="Heading1"/>
-      </w:pPr>
-      <w:r>
-        <w:t>해결</w:t>
-      </w:r>
-    </w:p>
-    <w:p>
-      <w:r>
-        <w:t>가이드북의 하루 90분 소리루틴을 그대로 앱의 코스로 옮긴다.</w:t>
-      </w:r>
-    </w:p>
-    <w:tbl>
-      <w:tblPr>
-        <w:tblStyle w:val="TableGrid"/>
-        <w:tblW w:type="auto" w:w="0"/>
-        <w:tblLook w:firstColumn="1" w:firstRow="1" w:lastColumn="0" w:lastRow="0" w:noHBand="0" w:noVBand="1" w:val="04A0"/>
-      </w:tblPr>
-      <w:tblGrid>
-        <w:gridCol w:w="2493"/>
-        <w:gridCol w:w="2493"/>
-        <w:gridCol w:w="2493"/>
-        <w:gridCol w:w="2493"/>
-      </w:tblGrid>
-      <w:tr>
-        <w:tc>
-          <w:tcPr>
-            <w:tcW w:type="dxa" w:w="2493"/>
-            <w:shd w:val="clear" w:color="auto" w:fill="E9EFEB"/>
-          </w:tcPr>
-          <w:p>
-            <w:r>
-              <w:rPr>
-                <w:b/>
-              </w:rPr>
+              <w:t xml:space="preserve">차진숙 디자이너 시안 11장과 같게. 오늘의 루틴만 </w:t>
             </w:r>
             <w:r>
               <w:rPr>
                 <w:b/>
                 <w:sz w:val="18"/>
               </w:rPr>
-              <w:t>루틴</w:t>
-            </w:r>
-          </w:p>
-        </w:tc>
-        <w:tc>
-          <w:tcPr>
-            <w:tcW w:type="dxa" w:w="2493"/>
-            <w:shd w:val="clear" w:color="auto" w:fill="E9EFEB"/>
-          </w:tcPr>
-          <w:p>
-            <w:r>
-              <w:rPr>
-                <w:b/>
-              </w:rPr>
+              <w:t>번호 길</w:t>
             </w:r>
             <w:r>
               <w:rPr>
-                <w:b/>
                 <w:sz w:val="18"/>
               </w:rPr>
-              <w:t>시간</w:t>
-            </w:r>
-          </w:p>
-        </w:tc>
-        <w:tc>
-          <w:tcPr>
-            <w:tcW w:type="dxa" w:w="2493"/>
-            <w:shd w:val="clear" w:color="auto" w:fill="E9EFEB"/>
-          </w:tcPr>
-          <w:p>
-            <w:r>
-              <w:rPr>
-                <w:b/>
-              </w:rPr>
-            </w:r>
-            <w:r>
-              <w:rPr>
-                <w:b/>
-                <w:sz w:val="18"/>
-              </w:rPr>
-              <w:t>방식</w:t>
-            </w:r>
-          </w:p>
-        </w:tc>
-        <w:tc>
-          <w:tcPr>
-            <w:tcW w:type="dxa" w:w="2493"/>
-            <w:shd w:val="clear" w:color="auto" w:fill="E9EFEB"/>
-          </w:tcPr>
-          <w:p>
-            <w:r>
-              <w:rPr>
-                <w:b/>
-              </w:rPr>
-            </w:r>
-            <w:r>
-              <w:rPr>
-                <w:b/>
-                <w:sz w:val="18"/>
-              </w:rPr>
-              <w:t>앱에서 하는 일</w:t>
+              <w:t>로 새로 디자인</w:t>
             </w:r>
           </w:p>
         </w:tc>
@@ -345,7 +240,7 @@
       <w:tr>
         <w:tc>
           <w:tcPr>
-            <w:tcW w:type="dxa" w:w="2493"/>
+            <w:tcW w:type="dxa" w:w="4986"/>
           </w:tcPr>
           <w:p>
             <w:r/>
@@ -353,13 +248,13 @@
               <w:rPr>
                 <w:sz w:val="18"/>
               </w:rPr>
-              <w:t>☀ 아침송</w:t>
+              <w:t>주 사용자</w:t>
             </w:r>
           </w:p>
         </w:tc>
         <w:tc>
           <w:tcPr>
-            <w:tcW w:type="dxa" w:w="2493"/>
+            <w:tcW w:type="dxa" w:w="4986"/>
           </w:tcPr>
           <w:p>
             <w:r/>
@@ -367,13 +262,15 @@
               <w:rPr>
                 <w:sz w:val="18"/>
               </w:rPr>
-              <w:t>20분</w:t>
+              <w:t>아이(6–10세). 부모는 함께 쓰고 확인한다</w:t>
             </w:r>
           </w:p>
         </w:tc>
+      </w:tr>
+      <w:tr>
         <w:tc>
           <w:tcPr>
-            <w:tcW w:type="dxa" w:w="2493"/>
+            <w:tcW w:type="dxa" w:w="4986"/>
           </w:tcPr>
           <w:p>
             <w:r/>
@@ -381,13 +278,13 @@
               <w:rPr>
                 <w:sz w:val="18"/>
               </w:rPr>
-              <w:t>듣기만</w:t>
+              <w:t>서버</w:t>
             </w:r>
           </w:p>
         </w:tc>
         <w:tc>
           <w:tcPr>
-            <w:tcW w:type="dxa" w:w="2493"/>
+            <w:tcW w:type="dxa" w:w="4986"/>
           </w:tcPr>
           <w:p>
             <w:r/>
@@ -395,192 +292,13 @@
               <w:rPr>
                 <w:sz w:val="18"/>
               </w:rPr>
-              <w:t>유튜브 링크 열기 → 타이머 → 완료 스티커</w:t>
-            </w:r>
-          </w:p>
-        </w:tc>
-      </w:tr>
-      <w:tr>
-        <w:tc>
-          <w:tcPr>
-            <w:tcW w:type="dxa" w:w="2493"/>
-          </w:tcPr>
-          <w:p>
-            <w:r/>
-            <w:r>
-              <w:rPr>
-                <w:sz w:val="18"/>
-              </w:rPr>
-              <w:t>🎨 주제 집중듣기</w:t>
-            </w:r>
-          </w:p>
-        </w:tc>
-        <w:tc>
-          <w:tcPr>
-            <w:tcW w:type="dxa" w:w="2493"/>
-          </w:tcPr>
-          <w:p>
-            <w:r/>
-            <w:r>
-              <w:rPr>
-                <w:sz w:val="18"/>
-              </w:rPr>
-              <w:t>30분</w:t>
-            </w:r>
-          </w:p>
-        </w:tc>
-        <w:tc>
-          <w:tcPr>
-            <w:tcW w:type="dxa" w:w="2493"/>
-          </w:tcPr>
-          <w:p>
-            <w:r/>
-            <w:r>
-              <w:rPr>
-                <w:sz w:val="18"/>
-              </w:rPr>
-              <w:t>보기 + 놀이</w:t>
-            </w:r>
-          </w:p>
-        </w:tc>
-        <w:tc>
-          <w:tcPr>
-            <w:tcW w:type="dxa" w:w="2493"/>
-          </w:tcPr>
-          <w:p>
-            <w:r/>
-            <w:r>
-              <w:rPr>
-                <w:sz w:val="18"/>
-              </w:rPr>
-              <w:t>영상 → 단어 맞추기 → 단어 말하기</w:t>
-            </w:r>
-          </w:p>
-        </w:tc>
-      </w:tr>
-      <w:tr>
-        <w:tc>
-          <w:tcPr>
-            <w:tcW w:type="dxa" w:w="2493"/>
-          </w:tcPr>
-          <w:p>
-            <w:r/>
-            <w:r>
-              <w:rPr>
-                <w:sz w:val="18"/>
-              </w:rPr>
-              <w:t>🍽 저녁송</w:t>
-            </w:r>
-          </w:p>
-        </w:tc>
-        <w:tc>
-          <w:tcPr>
-            <w:tcW w:type="dxa" w:w="2493"/>
-          </w:tcPr>
-          <w:p>
-            <w:r/>
-            <w:r>
-              <w:rPr>
-                <w:sz w:val="18"/>
-              </w:rPr>
-              <w:t>20분</w:t>
-            </w:r>
-          </w:p>
-        </w:tc>
-        <w:tc>
-          <w:tcPr>
-            <w:tcW w:type="dxa" w:w="2493"/>
-          </w:tcPr>
-          <w:p>
-            <w:r/>
-            <w:r>
-              <w:rPr>
-                <w:sz w:val="18"/>
-              </w:rPr>
-              <w:t>듣기만</w:t>
-            </w:r>
-          </w:p>
-        </w:tc>
-        <w:tc>
-          <w:tcPr>
-            <w:tcW w:type="dxa" w:w="2493"/>
-          </w:tcPr>
-          <w:p>
-            <w:r/>
-            <w:r>
-              <w:rPr>
-                <w:sz w:val="18"/>
-              </w:rPr>
-              <w:t>유튜브 링크 열기 → 타이머 → 완료 스티커</w:t>
-            </w:r>
-          </w:p>
-        </w:tc>
-      </w:tr>
-      <w:tr>
-        <w:tc>
-          <w:tcPr>
-            <w:tcW w:type="dxa" w:w="2493"/>
-          </w:tcPr>
-          <w:p>
-            <w:r/>
-            <w:r>
-              <w:rPr>
-                <w:sz w:val="18"/>
-              </w:rPr>
-              <w:t>🌙 잠자리 스토리</w:t>
-            </w:r>
-          </w:p>
-        </w:tc>
-        <w:tc>
-          <w:tcPr>
-            <w:tcW w:type="dxa" w:w="2493"/>
-          </w:tcPr>
-          <w:p>
-            <w:r/>
-            <w:r>
-              <w:rPr>
-                <w:sz w:val="18"/>
-              </w:rPr>
-              <w:t>20분</w:t>
-            </w:r>
-          </w:p>
-        </w:tc>
-        <w:tc>
-          <w:tcPr>
-            <w:tcW w:type="dxa" w:w="2493"/>
-          </w:tcPr>
-          <w:p>
-            <w:r/>
-            <w:r>
-              <w:rPr>
-                <w:sz w:val="18"/>
-              </w:rPr>
-              <w:t>듣기만</w:t>
-            </w:r>
-          </w:p>
-        </w:tc>
-        <w:tc>
-          <w:tcPr>
-            <w:tcW w:type="dxa" w:w="2493"/>
-          </w:tcPr>
-          <w:p>
-            <w:r/>
-            <w:r>
-              <w:rPr>
-                <w:sz w:val="18"/>
-              </w:rPr>
-              <w:t>유튜브 링크 열기 → 타이머 → 완료 스티커</w:t>
+              <w:t>FastAPI + 관계형 DB. 앱은 기기 저장 우선</w:t>
             </w:r>
           </w:p>
         </w:tc>
       </w:tr>
     </w:tbl>
     <w:p/>
-    <w:p>
-      <w:r>
-        <w:t>화면을 보는 루틴은 주제 집중듣기 하나뿐이다. 나머지는 틀어 두고 생활하면 된다.</w:t>
-      </w:r>
-    </w:p>
     <w:p>
       <w:pPr>
         <w:pStyle w:val="Heading1"/>
@@ -637,7 +355,7 @@
                 <w:b/>
                 <w:sz w:val="18"/>
               </w:rPr>
-              <w:t>역할</w:t>
+              <w:t>하는 일</w:t>
             </w:r>
           </w:p>
         </w:tc>
@@ -657,7 +375,7 @@
                 <w:b/>
                 <w:sz w:val="18"/>
               </w:rPr>
-              <w:t>화면</w:t>
+              <w:t>화면에서 지키는 것</w:t>
             </w:r>
           </w:p>
         </w:tc>
@@ -671,10 +389,9 @@
             <w:r/>
             <w:r>
               <w:rPr>
-                <w:b/>
                 <w:sz w:val="18"/>
               </w:rPr>
-              <w:t>아이 (6~10세, 주 사용자)</w:t>
+              <w:t>아이</w:t>
             </w:r>
           </w:p>
         </w:tc>
@@ -688,7 +405,7 @@
               <w:rPr>
                 <w:sz w:val="18"/>
               </w:rPr>
-              <w:t>코스 맵에서 오늘 루틴을 누르고, 주제 놀이를 하고, 스티커를 받는다</w:t>
+              <w:t>길을 따라 루틴을 열고, 듣고, 소리활동을 한다</w:t>
             </w:r>
           </w:p>
         </w:tc>
@@ -702,7 +419,7 @@
               <w:rPr>
                 <w:sz w:val="18"/>
               </w:rPr>
-              <w:t>홈, 레슨, 보상</w:t>
+              <w:t>글자 적게, 큰 그림, 큰 버튼</w:t>
             </w:r>
           </w:p>
         </w:tc>
@@ -732,7 +449,7 @@
               <w:rPr>
                 <w:sz w:val="18"/>
               </w:rPr>
-              <w:t>계정·시간·알림을 관리하고 기록을 본다. 영어 실력 불필요</w:t>
+              <w:t>가입, 아이 등록, 알림 시각, 기록 확인, ‘들었어요’ 표시</w:t>
             </w:r>
           </w:p>
         </w:tc>
@@ -746,7 +463,51 @@
               <w:rPr>
                 <w:sz w:val="18"/>
               </w:rPr>
-              <w:t>부모 대시보드, 설정</w:t>
+              <w:t>숫자와 표를 또렷하게</w:t>
+            </w:r>
+          </w:p>
+        </w:tc>
+      </w:tr>
+      <w:tr>
+        <w:tc>
+          <w:tcPr>
+            <w:tcW w:type="dxa" w:w="3324"/>
+          </w:tcPr>
+          <w:p>
+            <w:r/>
+            <w:r>
+              <w:rPr>
+                <w:sz w:val="18"/>
+              </w:rPr>
+              <w:t>교사(다음 단계)</w:t>
+            </w:r>
+          </w:p>
+        </w:tc>
+        <w:tc>
+          <w:tcPr>
+            <w:tcW w:type="dxa" w:w="3324"/>
+          </w:tcPr>
+          <w:p>
+            <w:r/>
+            <w:r>
+              <w:rPr>
+                <w:sz w:val="18"/>
+              </w:rPr>
+              <w:t>여러 아이 확인</w:t>
+            </w:r>
+          </w:p>
+        </w:tc>
+        <w:tc>
+          <w:tcPr>
+            <w:tcW w:type="dxa" w:w="3324"/>
+          </w:tcPr>
+          <w:p>
+            <w:r/>
+            <w:r>
+              <w:rPr>
+                <w:sz w:val="18"/>
+              </w:rPr>
+              <w:t>이번 버전에 없음</w:t>
             </w:r>
           </w:p>
         </w:tc>
@@ -754,16 +515,16 @@
     </w:tbl>
     <w:p/>
     <w:p>
-      <w:r>
-        <w:t>아이 화면은 글자를 최소로 하고 모든 안내를 그림과 소리로 준다. 부모 화면은 큰 글자와 한 줄에 하나씩, 전문 용어 없이 만든다.</w:t>
-      </w:r>
-    </w:p>
-    <w:p>
       <w:pPr>
         <w:pStyle w:val="Heading1"/>
       </w:pPr>
       <w:r>
-        <w:t>목표 (파일럿 지표)</w:t>
+        <w:t>화면 구성</w:t>
+      </w:r>
+    </w:p>
+    <w:p>
+      <w:r>
+        <w:t>네 개의 탭과 그 위에 뜨는 화면입니다.</w:t>
       </w:r>
     </w:p>
     <w:tbl>
@@ -773,13 +534,14 @@
         <w:tblLook w:firstColumn="1" w:firstRow="1" w:lastColumn="0" w:lastRow="0" w:noHBand="0" w:noVBand="1" w:val="04A0"/>
       </w:tblPr>
       <w:tblGrid>
-        <w:gridCol w:w="4986"/>
-        <w:gridCol w:w="4986"/>
+        <w:gridCol w:w="3324"/>
+        <w:gridCol w:w="3324"/>
+        <w:gridCol w:w="3324"/>
       </w:tblGrid>
       <w:tr>
         <w:tc>
           <w:tcPr>
-            <w:tcW w:type="dxa" w:w="4986"/>
+            <w:tcW w:type="dxa" w:w="3324"/>
             <w:shd w:val="clear" w:color="auto" w:fill="E9EFEB"/>
           </w:tcPr>
           <w:p>
@@ -793,13 +555,13 @@
                 <w:b/>
                 <w:sz w:val="18"/>
               </w:rPr>
-              <w:t>구분</w:t>
+              <w:t>탭</w:t>
             </w:r>
           </w:p>
         </w:tc>
         <w:tc>
           <w:tcPr>
-            <w:tcW w:type="dxa" w:w="4986"/>
+            <w:tcW w:type="dxa" w:w="3324"/>
             <w:shd w:val="clear" w:color="auto" w:fill="E9EFEB"/>
           </w:tcPr>
           <w:p>
@@ -813,7 +575,27 @@
                 <w:b/>
                 <w:sz w:val="18"/>
               </w:rPr>
-              <w:t>지표</w:t>
+              <w:t>내용</w:t>
+            </w:r>
+          </w:p>
+        </w:tc>
+        <w:tc>
+          <w:tcPr>
+            <w:tcW w:type="dxa" w:w="3324"/>
+            <w:shd w:val="clear" w:color="auto" w:fill="E9EFEB"/>
+          </w:tcPr>
+          <w:p>
+            <w:r>
+              <w:rPr>
+                <w:b/>
+              </w:rPr>
+            </w:r>
+            <w:r>
+              <w:rPr>
+                <w:b/>
+                <w:sz w:val="18"/>
+              </w:rPr>
+              <w:t>시안</w:t>
             </w:r>
           </w:p>
         </w:tc>
@@ -821,7 +603,7 @@
       <w:tr>
         <w:tc>
           <w:tcPr>
-            <w:tcW w:type="dxa" w:w="4986"/>
+            <w:tcW w:type="dxa" w:w="3324"/>
           </w:tcPr>
           <w:p>
             <w:r/>
@@ -829,13 +611,13 @@
               <w:rPr>
                 <w:sz w:val="18"/>
               </w:rPr>
-              <w:t>실천</w:t>
+              <w:t>오늘</w:t>
             </w:r>
           </w:p>
         </w:tc>
         <w:tc>
           <w:tcPr>
-            <w:tcW w:type="dxa" w:w="4986"/>
+            <w:tcW w:type="dxa" w:w="3324"/>
           </w:tcPr>
           <w:p>
             <w:r/>
@@ -843,7 +625,34 @@
               <w:rPr>
                 <w:sz w:val="18"/>
               </w:rPr>
-              <w:t>루틴별 시작·완료율, 하루 90분 달성률, 4주 잔존율</w:t>
+              <w:t xml:space="preserve">인사 카드, 오늘 진행, </w:t>
+            </w:r>
+            <w:r>
+              <w:rPr>
+                <w:b/>
+                <w:sz w:val="18"/>
+              </w:rPr>
+              <w:t>루틴 길(1·2·3·4)</w:t>
+            </w:r>
+            <w:r>
+              <w:rPr>
+                <w:sz w:val="18"/>
+              </w:rPr>
+              <w:t>, 루틴 시트</w:t>
+            </w:r>
+          </w:p>
+        </w:tc>
+        <w:tc>
+          <w:tcPr>
+            <w:tcW w:type="dxa" w:w="3324"/>
+          </w:tcPr>
+          <w:p>
+            <w:r/>
+            <w:r>
+              <w:rPr>
+                <w:sz w:val="18"/>
+              </w:rPr>
+              <w:t>01, 05A–D</w:t>
             </w:r>
           </w:p>
         </w:tc>
@@ -851,7 +660,7 @@
       <w:tr>
         <w:tc>
           <w:tcPr>
-            <w:tcW w:type="dxa" w:w="4986"/>
+            <w:tcW w:type="dxa" w:w="3324"/>
           </w:tcPr>
           <w:p>
             <w:r/>
@@ -859,13 +668,13 @@
               <w:rPr>
                 <w:sz w:val="18"/>
               </w:rPr>
-              <w:t>학습</w:t>
+              <w:t>소리여행</w:t>
             </w:r>
           </w:p>
         </w:tc>
         <w:tc>
           <w:tcPr>
-            <w:tcW w:type="dxa" w:w="4986"/>
+            <w:tcW w:type="dxa" w:w="3324"/>
           </w:tcPr>
           <w:p>
             <w:r/>
@@ -873,7 +682,21 @@
               <w:rPr>
                 <w:sz w:val="18"/>
               </w:rPr>
-              <w:t>주제 단어 정답률, 말하기 시도율</w:t>
+              <w:t>이번 주 카드, 소리활동 들어가기, 요일 줄, 48주 단계, 13주 미리보기</w:t>
+            </w:r>
+          </w:p>
+        </w:tc>
+        <w:tc>
+          <w:tcPr>
+            <w:tcW w:type="dxa" w:w="3324"/>
+          </w:tcPr>
+          <w:p>
+            <w:r/>
+            <w:r>
+              <w:rPr>
+                <w:sz w:val="18"/>
+              </w:rPr>
+              <w:t>02</w:t>
             </w:r>
           </w:p>
         </w:tc>
@@ -881,7 +704,7 @@
       <w:tr>
         <w:tc>
           <w:tcPr>
-            <w:tcW w:type="dxa" w:w="4986"/>
+            <w:tcW w:type="dxa" w:w="3324"/>
           </w:tcPr>
           <w:p>
             <w:r/>
@@ -895,7 +718,7 @@
         </w:tc>
         <w:tc>
           <w:tcPr>
-            <w:tcW w:type="dxa" w:w="4986"/>
+            <w:tcW w:type="dxa" w:w="3324"/>
           </w:tcPr>
           <w:p>
             <w:r/>
@@ -903,7 +726,65 @@
               <w:rPr>
                 <w:sz w:val="18"/>
               </w:rPr>
-              <w:t>“오늘 뭐 틀지” 고민 시간 감소, 재사용 의향</w:t>
+              <w:t>요약 네 칸, 오늘·주간·월간, 이번 주 한눈에, 모은 스티커</w:t>
+            </w:r>
+          </w:p>
+        </w:tc>
+        <w:tc>
+          <w:tcPr>
+            <w:tcW w:type="dxa" w:w="3324"/>
+          </w:tcPr>
+          <w:p>
+            <w:r/>
+            <w:r>
+              <w:rPr>
+                <w:sz w:val="18"/>
+              </w:rPr>
+              <w:t>03A–C</w:t>
+            </w:r>
+          </w:p>
+        </w:tc>
+      </w:tr>
+      <w:tr>
+        <w:tc>
+          <w:tcPr>
+            <w:tcW w:type="dxa" w:w="3324"/>
+          </w:tcPr>
+          <w:p>
+            <w:r/>
+            <w:r>
+              <w:rPr>
+                <w:sz w:val="18"/>
+              </w:rPr>
+              <w:t>설정</w:t>
+            </w:r>
+          </w:p>
+        </w:tc>
+        <w:tc>
+          <w:tcPr>
+            <w:tcW w:type="dxa" w:w="3324"/>
+          </w:tcPr>
+          <w:p>
+            <w:r/>
+            <w:r>
+              <w:rPr>
+                <w:sz w:val="18"/>
+              </w:rPr>
+              <w:t>알림, 저녁 리마인드, 하잉RTA 주말, 아이 정보, 안내, 계정</w:t>
+            </w:r>
+          </w:p>
+        </w:tc>
+        <w:tc>
+          <w:tcPr>
+            <w:tcW w:type="dxa" w:w="3324"/>
+          </w:tcPr>
+          <w:p>
+            <w:r/>
+            <w:r>
+              <w:rPr>
+                <w:sz w:val="18"/>
+              </w:rPr>
+              <w:t>04</w:t>
             </w:r>
           </w:p>
         </w:tc>
@@ -911,16 +792,13 @@
     </w:tbl>
     <w:p/>
     <w:p>
-      <w:pPr>
-        <w:pStyle w:val="Heading1"/>
-      </w:pPr>
       <w:r>
-        <w:t>범위</w:t>
+        <w:t>그 밖: 시작 영상(00), 로그인·가입, 아이 등록, 소리활동(단어 맞추기·말하기).</w:t>
       </w:r>
     </w:p>
     <w:p>
       <w:pPr>
-        <w:pStyle w:val="Heading2"/>
+        <w:pStyle w:val="Heading1"/>
       </w:pPr>
       <w:r>
         <w:t>포함</w:t>
@@ -931,7 +809,7 @@
         <w:pStyle w:val="ListBullet"/>
       </w:pPr>
       <w:r>
-        <w:t>회원가입·로그인, 아이 프로필(아바타 꾸미기 또는 얼굴 사진)</w:t>
+        <w:t>시작 영상 → 화면을 눌러 들어가기</w:t>
       </w:r>
     </w:p>
     <w:p>
@@ -939,7 +817,7 @@
         <w:pStyle w:val="ListBullet"/>
       </w:pPr>
       <w:r>
-        <w:t>코스 맵: Day 1~7, 하루 4루틴 노드, 연속일수</w:t>
+        <w:t>부모 계정 가입·로그인, 아이 등록(이름·연령·시작일·친구 4종 또는 사진)</w:t>
       </w:r>
     </w:p>
     <w:p>
@@ -947,7 +825,7 @@
         <w:pStyle w:val="ListBullet"/>
       </w:pPr>
       <w:r>
-        <w:t>듣기 루틴 3종: 유튜브 링크 + 타이머 + 완료</w:t>
+        <w:t>하루 4개 루틴: 유튜브로 열기, 듣기 시간 재기, 자동 완료와 직접 완료</w:t>
       </w:r>
     </w:p>
     <w:p>
@@ -955,7 +833,7 @@
         <w:pStyle w:val="ListBullet"/>
       </w:pPr>
       <w:r>
-        <w:t>주제 루틴: 영상 → 단어 맞추기 → 단어 말하기(음성인식)</w:t>
+        <w:t>번호 길: 오늘과 다음 3일, 완료 구간 색칠, 캐릭터</w:t>
       </w:r>
     </w:p>
     <w:p>
@@ -963,7 +841,7 @@
         <w:pStyle w:val="ListBullet"/>
       </w:pPr>
       <w:r>
-        <w:t>보상: 별, 스티커, 하루 완료 배지, 연속일수, 주간 트로피</w:t>
+        <w:t>소리활동: 단어 맞추기(4유형) → 단어 말하기(음성 인식, 도움 모드), 별</w:t>
       </w:r>
     </w:p>
     <w:p>
@@ -971,7 +849,7 @@
         <w:pStyle w:val="ListBullet"/>
       </w:pPr>
       <w:r>
-        <w:t>부모 확인 게이트, 부모 대시보드(요약·주간 루틴표·월간·통계)</w:t>
+        <w:t>스티커 28칸, 연속일</w:t>
       </w:r>
     </w:p>
     <w:p>
@@ -979,7 +857,7 @@
         <w:pStyle w:val="ListBullet"/>
       </w:pPr>
       <w:r>
-        <w:t>알림: 루틴 시각(앱 로컬 알림 / 웹 푸시)</w:t>
+        <w:t>부모 탭: 오늘·주간 표·월간 달력, ‘들었어요’ 표시·해제</w:t>
       </w:r>
     </w:p>
     <w:p>
@@ -987,7 +865,7 @@
         <w:pStyle w:val="ListBullet"/>
       </w:pPr>
       <w:r>
-        <w:t>설정: 알림 시간, 아이 프로필, 하잉RTA 주말 콘텐츠 스위치, 안내·FAQ, 계정 삭제</w:t>
+        <w:t>루틴 알림, 저녁 리마인드, 하잉RTA 주말 콘텐츠 선택</w:t>
       </w:r>
     </w:p>
     <w:p>
@@ -995,47 +873,7 @@
         <w:pStyle w:val="ListBullet"/>
       </w:pPr>
       <w:r>
-        <w:t>기능마다 첫 방문 가이드 팝업</w:t>
-      </w:r>
-    </w:p>
-    <w:p>
-      <w:pPr>
-        <w:pStyle w:val="Heading2"/>
-      </w:pPr>
-      <w:r>
-        <w:t>제외 (구조만 준비)</w:t>
-      </w:r>
-    </w:p>
-    <w:p>
-      <w:pPr>
-        <w:pStyle w:val="ListBullet"/>
-      </w:pPr>
-      <w:r>
-        <w:t>Week 2 이후 콘텐츠, 파닉스·읽기·쓰기</w:t>
-      </w:r>
-    </w:p>
-    <w:p>
-      <w:pPr>
-        <w:pStyle w:val="ListBullet"/>
-      </w:pPr>
-      <w:r>
-        <w:t>앱 내 유튜브 재생, 광고 처리</w:t>
-      </w:r>
-    </w:p>
-    <w:p>
-      <w:pPr>
-        <w:pStyle w:val="ListBullet"/>
-      </w:pPr>
-      <w:r>
-        <w:t>교사·기관 대시보드, 다국어, 소셜 로그인</w:t>
-      </w:r>
-    </w:p>
-    <w:p>
-      <w:pPr>
-        <w:pStyle w:val="ListBullet"/>
-      </w:pPr>
-      <w:r>
-        <w:t>하잉RTA Read–Talk–Apply 과정 자체</w:t>
+        <w:t>서버 설계와 구현: 스키마, API, 무결성 테스트</w:t>
       </w:r>
     </w:p>
     <w:p>
@@ -1043,7 +881,7 @@
         <w:pStyle w:val="Heading1"/>
       </w:pPr>
       <w:r>
-        <w:t>원칙</w:t>
+        <w:t>제외</w:t>
       </w:r>
     </w:p>
     <w:tbl>
@@ -1053,13 +891,14 @@
         <w:tblLook w:firstColumn="1" w:firstRow="1" w:lastColumn="0" w:lastRow="0" w:noHBand="0" w:noVBand="1" w:val="04A0"/>
       </w:tblPr>
       <w:tblGrid>
-        <w:gridCol w:w="4986"/>
-        <w:gridCol w:w="4986"/>
+        <w:gridCol w:w="3324"/>
+        <w:gridCol w:w="3324"/>
+        <w:gridCol w:w="3324"/>
       </w:tblGrid>
       <w:tr>
         <w:tc>
           <w:tcPr>
-            <w:tcW w:type="dxa" w:w="4986"/>
+            <w:tcW w:type="dxa" w:w="3324"/>
             <w:shd w:val="clear" w:color="auto" w:fill="E9EFEB"/>
           </w:tcPr>
           <w:p>
@@ -1073,13 +912,13 @@
                 <w:b/>
                 <w:sz w:val="18"/>
               </w:rPr>
-              <w:t>원칙</w:t>
+              <w:t>제외</w:t>
             </w:r>
           </w:p>
         </w:tc>
         <w:tc>
           <w:tcPr>
-            <w:tcW w:type="dxa" w:w="4986"/>
+            <w:tcW w:type="dxa" w:w="3324"/>
             <w:shd w:val="clear" w:color="auto" w:fill="E9EFEB"/>
           </w:tcPr>
           <w:p>
@@ -1093,7 +932,27 @@
                 <w:b/>
                 <w:sz w:val="18"/>
               </w:rPr>
-              <w:t>구현</w:t>
+              <w:t>이유</w:t>
+            </w:r>
+          </w:p>
+        </w:tc>
+        <w:tc>
+          <w:tcPr>
+            <w:tcW w:type="dxa" w:w="3324"/>
+            <w:shd w:val="clear" w:color="auto" w:fill="E9EFEB"/>
+          </w:tcPr>
+          <w:p>
+            <w:r>
+              <w:rPr>
+                <w:b/>
+              </w:rPr>
+            </w:r>
+            <w:r>
+              <w:rPr>
+                <w:b/>
+                <w:sz w:val="18"/>
+              </w:rPr>
+              <w:t>준비해 둔 것</w:t>
             </w:r>
           </w:p>
         </w:tc>
@@ -1101,7 +960,7 @@
       <w:tr>
         <w:tc>
           <w:tcPr>
-            <w:tcW w:type="dxa" w:w="4986"/>
+            <w:tcW w:type="dxa" w:w="3324"/>
           </w:tcPr>
           <w:p>
             <w:r/>
@@ -1109,13 +968,13 @@
               <w:rPr>
                 <w:sz w:val="18"/>
               </w:rPr>
-              <w:t>‘많이’보다 ‘매일’</w:t>
+              <w:t>부모 확인(잠금)</w:t>
             </w:r>
           </w:p>
         </w:tc>
         <w:tc>
           <w:tcPr>
-            <w:tcW w:type="dxa" w:w="4986"/>
+            <w:tcW w:type="dxa" w:w="3324"/>
           </w:tcPr>
           <w:p>
             <w:r/>
@@ -1123,7 +982,21 @@
               <w:rPr>
                 <w:sz w:val="18"/>
               </w:rPr>
-              <w:t>하루 단위 코스, 연속일수, 즉시 보상. 한 주 내내 같은 영상 반복</w:t>
+              <w:t>MVP에서는 빼기로 결정</w:t>
+            </w:r>
+          </w:p>
+        </w:tc>
+        <w:tc>
+          <w:tcPr>
+            <w:tcW w:type="dxa" w:w="3324"/>
+          </w:tcPr>
+          <w:p>
+            <w:r/>
+            <w:r>
+              <w:rPr>
+                <w:sz w:val="18"/>
+              </w:rPr>
+              <w:t>부모 탭은 바로 열린다</w:t>
             </w:r>
           </w:p>
         </w:tc>
@@ -1131,7 +1004,7 @@
       <w:tr>
         <w:tc>
           <w:tcPr>
-            <w:tcW w:type="dxa" w:w="4986"/>
+            <w:tcW w:type="dxa" w:w="3324"/>
           </w:tcPr>
           <w:p>
             <w:r/>
@@ -1139,13 +1012,13 @@
               <w:rPr>
                 <w:sz w:val="18"/>
               </w:rPr>
-              <w:t>생활 속 소리 배치</w:t>
+              <w:t>2주차 이후, 파닉스</w:t>
             </w:r>
           </w:p>
         </w:tc>
         <w:tc>
           <w:tcPr>
-            <w:tcW w:type="dxa" w:w="4986"/>
+            <w:tcW w:type="dxa" w:w="3324"/>
           </w:tcPr>
           <w:p>
             <w:r/>
@@ -1153,7 +1026,28 @@
               <w:rPr>
                 <w:sz w:val="18"/>
               </w:rPr>
-              <w:t>알림이 생활시간에 오고, 영상은 유튜브에서 틀고 앱은 시간만 잰다</w:t>
+              <w:t>이번은 1주차만</w:t>
+            </w:r>
+          </w:p>
+        </w:tc>
+        <w:tc>
+          <w:tcPr>
+            <w:tcW w:type="dxa" w:w="3324"/>
+          </w:tcPr>
+          <w:p>
+            <w:r/>
+            <w:r>
+              <w:rPr>
+                <w:rFonts w:ascii="Consolas" w:hAnsi="Consolas" w:eastAsia="Consolas"/>
+                <w:sz w:val="18"/>
+              </w:rPr>
+              <w:t>weeks</w:t>
+            </w:r>
+            <w:r>
+              <w:rPr>
+                <w:sz w:val="18"/>
+              </w:rPr>
+              <w:t xml:space="preserve"> 테이블, 여정 화면</w:t>
             </w:r>
           </w:p>
         </w:tc>
@@ -1161,7 +1055,7 @@
       <w:tr>
         <w:tc>
           <w:tcPr>
-            <w:tcW w:type="dxa" w:w="4986"/>
+            <w:tcW w:type="dxa" w:w="3324"/>
           </w:tcPr>
           <w:p>
             <w:r/>
@@ -1169,13 +1063,13 @@
               <w:rPr>
                 <w:sz w:val="18"/>
               </w:rPr>
-              <w:t>강요 없는 말하기</w:t>
+              <w:t>간단 진단</w:t>
             </w:r>
           </w:p>
         </w:tc>
         <w:tc>
           <w:tcPr>
-            <w:tcW w:type="dxa" w:w="4986"/>
+            <w:tcW w:type="dxa" w:w="3324"/>
           </w:tcPr>
           <w:p>
             <w:r/>
@@ -1183,7 +1077,21 @@
               <w:rPr>
                 <w:sz w:val="18"/>
               </w:rPr>
-              <w:t>말하기는 건너뛸 수 있고 실패해도 통과. 벌점·하트 없음</w:t>
+              <w:t>연령 선택으로 대신</w:t>
+            </w:r>
+          </w:p>
+        </w:tc>
+        <w:tc>
+          <w:tcPr>
+            <w:tcW w:type="dxa" w:w="3324"/>
+          </w:tcPr>
+          <w:p>
+            <w:r/>
+            <w:r>
+              <w:rPr>
+                <w:sz w:val="18"/>
+              </w:rPr>
+              <w:t>난이도 설정값</w:t>
             </w:r>
           </w:p>
         </w:tc>
@@ -1191,7 +1099,7 @@
       <w:tr>
         <w:tc>
           <w:tcPr>
-            <w:tcW w:type="dxa" w:w="4986"/>
+            <w:tcW w:type="dxa" w:w="3324"/>
           </w:tcPr>
           <w:p>
             <w:r/>
@@ -1199,13 +1107,13 @@
               <w:rPr>
                 <w:sz w:val="18"/>
               </w:rPr>
-              <w:t>부모 준비 0</w:t>
+              <w:t>교사·기관 대시보드</w:t>
             </w:r>
           </w:p>
         </w:tc>
         <w:tc>
           <w:tcPr>
-            <w:tcW w:type="dxa" w:w="4986"/>
+            <w:tcW w:type="dxa" w:w="3324"/>
           </w:tcPr>
           <w:p>
             <w:r/>
@@ -1213,7 +1121,28 @@
               <w:rPr>
                 <w:sz w:val="18"/>
               </w:rPr>
-              <w:t>오늘 카드에 “지금 틀 영상” 하나만</w:t>
+              <w:t>파일럿 단계</w:t>
+            </w:r>
+          </w:p>
+        </w:tc>
+        <w:tc>
+          <w:tcPr>
+            <w:tcW w:type="dxa" w:w="3324"/>
+          </w:tcPr>
+          <w:p>
+            <w:r/>
+            <w:r>
+              <w:rPr>
+                <w:rFonts w:ascii="Consolas" w:hAnsi="Consolas" w:eastAsia="Consolas"/>
+                <w:sz w:val="18"/>
+              </w:rPr>
+              <w:t>events</w:t>
+            </w:r>
+            <w:r>
+              <w:rPr>
+                <w:sz w:val="18"/>
+              </w:rPr>
+              <w:t>, 리포트 API</w:t>
             </w:r>
           </w:p>
         </w:tc>
@@ -1221,7 +1150,7 @@
       <w:tr>
         <w:tc>
           <w:tcPr>
-            <w:tcW w:type="dxa" w:w="4986"/>
+            <w:tcW w:type="dxa" w:w="3324"/>
           </w:tcPr>
           <w:p>
             <w:r/>
@@ -1229,13 +1158,13 @@
               <w:rPr>
                 <w:sz w:val="18"/>
               </w:rPr>
-              <w:t>공공 영어와 신앙교육 분리</w:t>
+              <w:t>서버 동기화 연결</w:t>
             </w:r>
           </w:p>
         </w:tc>
         <w:tc>
           <w:tcPr>
-            <w:tcW w:type="dxa" w:w="4986"/>
+            <w:tcW w:type="dxa" w:w="3324"/>
           </w:tcPr>
           <w:p>
             <w:r/>
@@ -1243,7 +1172,21 @@
               <w:rPr>
                 <w:sz w:val="18"/>
               </w:rPr>
-              <w:t>하잉RTA는 부모가 켤 때만, 기본 꺼짐</w:t>
+              <w:t>기기 저장으로 충분</w:t>
+            </w:r>
+          </w:p>
+        </w:tc>
+        <w:tc>
+          <w:tcPr>
+            <w:tcW w:type="dxa" w:w="3324"/>
+          </w:tcPr>
+          <w:p>
+            <w:r/>
+            <w:r>
+              <w:rPr>
+                <w:sz w:val="18"/>
+              </w:rPr>
+              <w:t>계정 저장소 인터페이스, API</w:t>
             </w:r>
           </w:p>
         </w:tc>
@@ -1251,7 +1194,7 @@
       <w:tr>
         <w:tc>
           <w:tcPr>
-            <w:tcW w:type="dxa" w:w="4986"/>
+            <w:tcW w:type="dxa" w:w="3324"/>
           </w:tcPr>
           <w:p>
             <w:r/>
@@ -1259,13 +1202,13 @@
               <w:rPr>
                 <w:sz w:val="18"/>
               </w:rPr>
-              <w:t>개인정보 최소</w:t>
+              <w:t>앱 안 영상 재생</w:t>
             </w:r>
           </w:p>
         </w:tc>
         <w:tc>
           <w:tcPr>
-            <w:tcW w:type="dxa" w:w="4986"/>
+            <w:tcW w:type="dxa" w:w="3324"/>
           </w:tcPr>
           <w:p>
             <w:r/>
@@ -1273,13 +1216,90 @@
               <w:rPr>
                 <w:sz w:val="18"/>
               </w:rPr>
-              <w:t>아이 실명·생년월일 없음</w:t>
+              <w:t>유튜브로 여는 방식으로 결정</w:t>
+            </w:r>
+          </w:p>
+        </w:tc>
+        <w:tc>
+          <w:tcPr>
+            <w:tcW w:type="dxa" w:w="3324"/>
+          </w:tcPr>
+          <w:p>
+            <w:r/>
+            <w:r>
+              <w:rPr>
+                <w:rFonts w:ascii="Consolas" w:hAnsi="Consolas" w:eastAsia="Consolas"/>
+                <w:sz w:val="18"/>
+              </w:rPr>
+              <w:t>video_id</w:t>
+            </w:r>
+            <w:r>
+              <w:rPr>
+                <w:sz w:val="18"/>
+              </w:rPr>
+              <w:t xml:space="preserve"> 보관</w:t>
             </w:r>
           </w:p>
         </w:tc>
       </w:tr>
     </w:tbl>
     <w:p/>
+    <w:p>
+      <w:pPr>
+        <w:pStyle w:val="Heading1"/>
+      </w:pPr>
+      <w:r>
+        <w:t>원칙</w:t>
+      </w:r>
+    </w:p>
+    <w:p>
+      <w:pPr>
+        <w:pStyle w:val="ListNumber"/>
+      </w:pPr>
+      <w:r>
+        <w:t>아이 화면은 읽지 않아도 쓸 수 있어야 한다.</w:t>
+      </w:r>
+    </w:p>
+    <w:p>
+      <w:pPr>
+        <w:pStyle w:val="ListNumber"/>
+      </w:pPr>
+      <w:r>
+        <w:t>시안과 같게 만든다. 값은 디자인 토큰 한 곳에 둔다.</w:t>
+      </w:r>
+    </w:p>
+    <w:p>
+      <w:pPr>
+        <w:pStyle w:val="ListNumber"/>
+      </w:pPr>
+      <w:r>
+        <w:t>글·숫자·색·콘텐츠를 코드에 박지 않는다. JSON과 토큰, 문구 파일에 둔다.</w:t>
+      </w:r>
+    </w:p>
+    <w:p>
+      <w:pPr>
+        <w:pStyle w:val="ListNumber"/>
+      </w:pPr>
+      <w:r>
+        <w:t>기록은 거짓이 없어야 한다. 어떻게 완료했는지(타이머·직접·부모)를 구분한다.</w:t>
+      </w:r>
+    </w:p>
+    <w:p>
+      <w:pPr>
+        <w:pStyle w:val="ListNumber"/>
+      </w:pPr>
+      <w:r>
+        <w:t>아이 정보는 최소로. 사진은 기기를 떠나지 않는다.</w:t>
+      </w:r>
+    </w:p>
+    <w:p>
+      <w:pPr>
+        <w:pStyle w:val="ListNumber"/>
+      </w:pPr>
+      <w:r>
+        <w:t>신앙 콘텐츠는 부모가 켤 때만.</w:t>
+      </w:r>
+    </w:p>
     <w:p>
       <w:pPr>
         <w:pStyle w:val="Heading1"/>
@@ -1372,6 +1392,50 @@
               <w:rPr>
                 <w:sz w:val="18"/>
               </w:rPr>
+              <w:t>00</w:t>
+            </w:r>
+          </w:p>
+        </w:tc>
+        <w:tc>
+          <w:tcPr>
+            <w:tcW w:type="dxa" w:w="3324"/>
+          </w:tcPr>
+          <w:p>
+            <w:r/>
+            <w:r>
+              <w:rPr>
+                <w:sz w:val="18"/>
+              </w:rPr>
+              <w:t>지원서 분석</w:t>
+            </w:r>
+          </w:p>
+        </w:tc>
+        <w:tc>
+          <w:tcPr>
+            <w:tcW w:type="dxa" w:w="3324"/>
+          </w:tcPr>
+          <w:p>
+            <w:r/>
+            <w:r>
+              <w:rPr>
+                <w:sz w:val="18"/>
+              </w:rPr>
+              <w:t>지원서 내용과 기능의 연결</w:t>
+            </w:r>
+          </w:p>
+        </w:tc>
+      </w:tr>
+      <w:tr>
+        <w:tc>
+          <w:tcPr>
+            <w:tcW w:type="dxa" w:w="3324"/>
+          </w:tcPr>
+          <w:p>
+            <w:r/>
+            <w:r>
+              <w:rPr>
+                <w:sz w:val="18"/>
+              </w:rPr>
               <w:t>01</w:t>
             </w:r>
           </w:p>
@@ -1444,7 +1508,7 @@
               <w:rPr>
                 <w:sz w:val="18"/>
               </w:rPr>
-              <w:t>기능·비기능 요구사항</w:t>
+              <w:t>기능·비기능 요구</w:t>
             </w:r>
           </w:p>
         </w:tc>
@@ -1488,7 +1552,7 @@
               <w:rPr>
                 <w:sz w:val="18"/>
               </w:rPr>
-              <w:t>행위자, 유즈케이스 다이어그램, 시나리오</w:t>
+              <w:t>유즈케이스 다이어그램과 시나리오</w:t>
             </w:r>
           </w:p>
         </w:tc>
@@ -1532,7 +1596,7 @@
               <w:rPr>
                 <w:sz w:val="18"/>
               </w:rPr>
-              <w:t>화면별 구성·인터랙션·상태</w:t>
+              <w:t>화면별 구성과 동작, 실제 화면</w:t>
             </w:r>
           </w:p>
         </w:tc>
@@ -1562,7 +1626,7 @@
               <w:rPr>
                 <w:sz w:val="18"/>
               </w:rPr>
-              <w:t>팝업·가이드 명세서</w:t>
+              <w:t>데이터베이스 설계서</w:t>
             </w:r>
           </w:p>
         </w:tc>
@@ -1576,7 +1640,7 @@
               <w:rPr>
                 <w:sz w:val="18"/>
               </w:rPr>
-              <w:t>모든 팝업, 시트, 토스트, 첫 방문 가이드</w:t>
+              <w:t>ERD, 테이블, 무결성 규칙</w:t>
             </w:r>
           </w:p>
         </w:tc>
@@ -1606,7 +1670,7 @@
               <w:rPr>
                 <w:sz w:val="18"/>
               </w:rPr>
-              <w:t>데이터·API 명세서</w:t>
+              <w:t>API 명세서</w:t>
             </w:r>
           </w:p>
         </w:tc>
@@ -1620,7 +1684,7 @@
               <w:rPr>
                 <w:sz w:val="18"/>
               </w:rPr>
-              <w:t>ERD, 테이블, API, 콘텐츠 JSON, 이벤트</w:t>
+              <w:t>엔드포인트, 요청·응답, 오류</w:t>
             </w:r>
           </w:p>
         </w:tc>
@@ -1650,7 +1714,7 @@
               <w:rPr>
                 <w:sz w:val="18"/>
               </w:rPr>
-              <w:t>아키텍처·코드 규칙</w:t>
+              <w:t>설계 모델 (UML)</w:t>
             </w:r>
           </w:p>
         </w:tc>
@@ -1664,7 +1728,7 @@
               <w:rPr>
                 <w:sz w:val="18"/>
               </w:rPr>
-              <w:t>스택, 폴더 구조, 플랫폼 어댑터, 규칙</w:t>
+              <w:t>클래스·시퀀스·상태·컴포넌트 다이어그램</w:t>
             </w:r>
           </w:p>
         </w:tc>
@@ -1694,7 +1758,7 @@
               <w:rPr>
                 <w:sz w:val="18"/>
               </w:rPr>
-              <w:t>디자인 가이드</w:t>
+              <w:t>아키텍처·코드 규칙</w:t>
             </w:r>
           </w:p>
         </w:tc>
@@ -1708,7 +1772,7 @@
               <w:rPr>
                 <w:sz w:val="18"/>
               </w:rPr>
-              <w:t>토큰, 컴포넌트, 캐릭터 시스템, 그림 목록</w:t>
+              <w:t>폴더, 의존 규칙, 배포</w:t>
             </w:r>
           </w:p>
         </w:tc>
@@ -1738,7 +1802,7 @@
               <w:rPr>
                 <w:sz w:val="18"/>
               </w:rPr>
-              <w:t>테스트 계획</w:t>
+              <w:t>디자인 가이드</w:t>
             </w:r>
           </w:p>
         </w:tc>
@@ -1752,7 +1816,7 @@
               <w:rPr>
                 <w:sz w:val="18"/>
               </w:rPr>
-              <w:t>인수 기준, 기기 매트릭스</w:t>
+              <w:t>색·글꼴·간격·컴포넌트 값</w:t>
             </w:r>
           </w:p>
         </w:tc>
@@ -1782,6 +1846,50 @@
               <w:rPr>
                 <w:sz w:val="18"/>
               </w:rPr>
+              <w:t>테스트 계획</w:t>
+            </w:r>
+          </w:p>
+        </w:tc>
+        <w:tc>
+          <w:tcPr>
+            <w:tcW w:type="dxa" w:w="3324"/>
+          </w:tcPr>
+          <w:p>
+            <w:r/>
+            <w:r>
+              <w:rPr>
+                <w:sz w:val="18"/>
+              </w:rPr>
+              <w:t>단위·통합·화면 테스트, 인수 기준</w:t>
+            </w:r>
+          </w:p>
+        </w:tc>
+      </w:tr>
+      <w:tr>
+        <w:tc>
+          <w:tcPr>
+            <w:tcW w:type="dxa" w:w="3324"/>
+          </w:tcPr>
+          <w:p>
+            <w:r/>
+            <w:r>
+              <w:rPr>
+                <w:sz w:val="18"/>
+              </w:rPr>
+              <w:t>11</w:t>
+            </w:r>
+          </w:p>
+        </w:tc>
+        <w:tc>
+          <w:tcPr>
+            <w:tcW w:type="dxa" w:w="3324"/>
+          </w:tcPr>
+          <w:p>
+            <w:r/>
+            <w:r>
+              <w:rPr>
+                <w:sz w:val="18"/>
+              </w:rPr>
               <w:t>결정 기록·오픈 이슈</w:t>
             </w:r>
           </w:p>
@@ -1796,7 +1904,7 @@
               <w:rPr>
                 <w:sz w:val="18"/>
               </w:rPr>
-              <w:t>결정된 것, 결정할 것</w:t>
+              <w:t>결정과 확인할 것</w:t>
             </w:r>
           </w:p>
         </w:tc>

</xml_diff>

<commit_message>
Add the Color Magic speaking game, real phone notifications and an Android build
- Speaking game: say the colour and the grey sketch fills in; word level then
  sentence level ("What color is it?" / "It's red."), driven by week content
- Notifications: chick status icon, per-routine character as the large icon,
  routine colour, exact alarms, a "start now" action and a test button.
  expo-notifications is patched and built from source so each notification
  can pick its own art
- Journey stage cards: stage icons, theme chips with week ranges, 12-week meter
- Parent tab: hardest words and this week's talk tips; data saver setting
- Art generated with Recraft (studio, palette, brush, rainbow, medal, clay icons);
  no emoji left in the app
- API: speak_attempts.mode with UNIQUE(activity, word, mode)
- Docs: principle audit against the application, game/notification/Android design

Co-Authored-By: Claude Fable 5.1 <noreply@anthropic.com>
</commit_message>
<xml_diff>
--- a/docs/docx/01-비전과-범위.docx
+++ b/docs/docx/01-비전과-범위.docx
@@ -1909,6 +1909,50 @@
           </w:p>
         </w:tc>
       </w:tr>
+      <w:tr>
+        <w:tc>
+          <w:tcPr>
+            <w:tcW w:type="dxa" w:w="3324"/>
+          </w:tcPr>
+          <w:p>
+            <w:r/>
+            <w:r>
+              <w:rPr>
+                <w:sz w:val="18"/>
+              </w:rPr>
+              <w:t>12</w:t>
+            </w:r>
+          </w:p>
+        </w:tc>
+        <w:tc>
+          <w:tcPr>
+            <w:tcW w:type="dxa" w:w="3324"/>
+          </w:tcPr>
+          <w:p>
+            <w:r/>
+            <w:r>
+              <w:rPr>
+                <w:sz w:val="18"/>
+              </w:rPr>
+              <w:t>원칙 점검과 보완</w:t>
+            </w:r>
+          </w:p>
+        </w:tc>
+        <w:tc>
+          <w:tcPr>
+            <w:tcW w:type="dxa" w:w="3324"/>
+          </w:tcPr>
+          <w:p>
+            <w:r/>
+            <w:r>
+              <w:rPr>
+                <w:sz w:val="18"/>
+              </w:rPr>
+              <w:t>지원서 원칙 대조, 말하기 게임, 알림, 안드로이드 앱</w:t>
+            </w:r>
+          </w:p>
+        </w:tc>
+      </w:tr>
     </w:tbl>
     <w:p/>
     <w:sectPr>

</xml_diff>

<commit_message>
Play routine videos inside the app instead of opening YouTube
- shared/platform/youtube: IFrame player for web and WebView player for native, with pure helpers and tests
- today: useRoutinePlayback hook, RoutinePlayer card, sheet split into parts
- Listening time now runs only while the video is playing; a cover hides YouTube suggestions when paused
- Videos that refuse embedding fall back to opening YouTube
- Docs, application figure and ESLint config updated

Co-Authored-By: Claude Fable 5.1 <noreply@anthropic.com>
</commit_message>
<xml_diff>
--- a/docs/docx/01-비전과-범위.docx
+++ b/docs/docx/01-비전과-범위.docx
@@ -825,7 +825,7 @@
         <w:pStyle w:val="ListBullet"/>
       </w:pPr>
       <w:r>
-        <w:t>하루 4개 루틴: 유튜브로 열기, 듣기 시간 재기, 자동 완료와 직접 완료</w:t>
+        <w:t>하루 4개 루틴: 앱 안에서 영상 보기, 듣기 시간 재기, 자동 완료와 직접 완료</w:t>
       </w:r>
     </w:p>
     <w:p>
@@ -1216,7 +1216,7 @@
               <w:rPr>
                 <w:sz w:val="18"/>
               </w:rPr>
-              <w:t>유튜브로 여는 방식으로 결정</w:t>
+              <w:t>구현함 (D-26)</w:t>
             </w:r>
           </w:p>
         </w:tc>
@@ -1228,16 +1228,9 @@
             <w:r/>
             <w:r>
               <w:rPr>
-                <w:rFonts w:ascii="Consolas" w:hAnsi="Consolas" w:eastAsia="Consolas"/>
                 <w:sz w:val="18"/>
               </w:rPr>
-              <w:t>video_id</w:t>
-            </w:r>
-            <w:r>
-              <w:rPr>
-                <w:sz w:val="18"/>
-              </w:rPr>
-              <w:t xml:space="preserve"> 보관</w:t>
+              <w:t>유튜브 IFrame 플레이어</w:t>
             </w:r>
           </w:p>
         </w:tc>

</xml_diff>